<commit_message>
Perbaiki fungsi/jabatan tim di tabel personel Surat Tugas jadi lebih profesional
Nama lengkap dilengkapi untuk Farhan Budiman & Ilmania Syakira (sesuai
memory/entities.md), deskripsi fungsi dirapikan (typo, konsistensi
format "X & Y Engineer"/"Lead"). Fungsi Anggi/Syifa/Aldi masih
placeholder, menunggu konfirmasi user.

Co-Authored-By: Claude Sonnet 5 <noreply@anthropic.com>
Claude-Session: https://claude.ai/code/session_013BFGCyoYuctMwQ4HieaJZM
</commit_message>
<xml_diff>
--- a/Deliverables/Surat Tugas/Surat_Tugas_LGU_SP-001_Assessment_GLD.docx
+++ b/Deliverables/Surat Tugas/Surat_Tugas_LGU_SP-001_Assessment_GLD.docx
@@ -324,7 +324,7 @@
           </w:tcPr>
           <w:p>
             <w:r>
-              <w:t>Ketua Proyek, Hardware Lead</w:t>
+              <w:t>Ketua Proyek &amp; Hardware Lead</w:t>
             </w:r>
           </w:p>
         </w:tc>
@@ -383,7 +383,7 @@
           </w:tcPr>
           <w:p>
             <w:r>
-              <w:t>Project Lead Administrasi Sertifikasi</w:t>
+              <w:t>Project Lead – Administrasi Sertifikasi</w:t>
             </w:r>
           </w:p>
         </w:tc>
@@ -501,7 +501,7 @@
           </w:tcPr>
           <w:p>
             <w:r>
-              <w:t>Jaringan LoRa, Konektivitas, System</w:t>
+              <w:t>Jaringan LoRa, Konektivitas, dan Sistem</w:t>
             </w:r>
           </w:p>
         </w:tc>
@@ -543,7 +543,7 @@
           </w:tcPr>
           <w:p>
             <w:r>
-              <w:t>Farhan</w:t>
+              <w:t>Farhan Budiman</w:t>
             </w:r>
           </w:p>
         </w:tc>
@@ -560,7 +560,7 @@
           </w:tcPr>
           <w:p>
             <w:r>
-              <w:t>Design, Aplikasi, Pelaporan, Software Developer, CAD Design, Dokumentasi</w:t>
+              <w:t>Software Developer – Desain Aplikasi, CAD Design, Dokumentasi &amp; Pelaporan</w:t>
             </w:r>
           </w:p>
         </w:tc>
@@ -619,7 +619,7 @@
           </w:tcPr>
           <w:p>
             <w:r>
-              <w:t>Hardware, Firmware</w:t>
+              <w:t>Hardware &amp; Firmware Engineer</w:t>
             </w:r>
           </w:p>
         </w:tc>
@@ -661,7 +661,7 @@
           </w:tcPr>
           <w:p>
             <w:r>
-              <w:t>Ilma</w:t>
+              <w:t>Ilmania Syakira</w:t>
             </w:r>
           </w:p>
         </w:tc>
@@ -678,7 +678,7 @@
           </w:tcPr>
           <w:p>
             <w:r>
-              <w:t>Machine Learning</w:t>
+              <w:t>Machine Learning Engineer</w:t>
             </w:r>
           </w:p>
         </w:tc>
@@ -737,7 +737,7 @@
           </w:tcPr>
           <w:p>
             <w:r>
-              <w:t>Hardware, PCB Design</w:t>
+              <w:t>Hardware &amp; PCB Design Engineer</w:t>
             </w:r>
           </w:p>
         </w:tc>

</xml_diff>

<commit_message>
Lengkapi gelar akademik, nama lengkap, dan tambahkan Erick R Koncara ke tabel personel Surat Tugas
Gelar lengkap ditambahkan untuk Maman Budiman, Fahdzi Muttaqien, Nina
Siti Aminah; nama lengkap Beny Agustirandi. Fungsi Farhan diperjelas
sesuai deskripsi user (software frontend, desain presentasi/CAD 3D,
pelaporan). Fungsi Anggi/Syifa/Aldi diisi (masing-masing mendukung
Ilma/Beny/Ryan). Baris ke-12 ditambahkan untuk Erick R Koncara
(Komunikator). Nama "Fahmi" masih menunggu klarifikasi ejaan lengkap.

Co-Authored-By: Claude Sonnet 5 <noreply@anthropic.com>
Claude-Session: https://claude.ai/code/session_013BFGCyoYuctMwQ4HieaJZM
</commit_message>
<xml_diff>
--- a/Deliverables/Surat Tugas/Surat_Tugas_LGU_SP-001_Assessment_GLD.docx
+++ b/Deliverables/Surat Tugas/Surat_Tugas_LGU_SP-001_Assessment_GLD.docx
@@ -307,7 +307,7 @@
           </w:tcPr>
           <w:p>
             <w:r>
-              <w:t>Dr. Maman Budiman</w:t>
+              <w:t>Drs. Maman Budiman, M.Eng., Ph.D.</w:t>
             </w:r>
           </w:p>
         </w:tc>
@@ -366,7 +366,7 @@
           </w:tcPr>
           <w:p>
             <w:r>
-              <w:t>Dr. Nina Aminah</w:t>
+              <w:t>Dr. Nina Siti Aminah, S.T., S.Si., M.Si.</w:t>
             </w:r>
           </w:p>
         </w:tc>
@@ -425,7 +425,7 @@
           </w:tcPr>
           <w:p>
             <w:r>
-              <w:t>Dr. Fahdzi</w:t>
+              <w:t>Dr. Fahdzi Muttaqien, S.Si., M.Si., M.Sc., M.Eng., Ph.D.</w:t>
             </w:r>
           </w:p>
         </w:tc>
@@ -484,7 +484,7 @@
           </w:tcPr>
           <w:p>
             <w:r>
-              <w:t>Beny</w:t>
+              <w:t>Beny Agustirandi</w:t>
             </w:r>
           </w:p>
         </w:tc>
@@ -560,7 +560,7 @@
           </w:tcPr>
           <w:p>
             <w:r>
-              <w:t>Software Developer – Desain Aplikasi, CAD Design, Dokumentasi &amp; Pelaporan</w:t>
+              <w:t>Software Frontend Developer – Desain Presentasi, CAD 3D Design, dan Pelaporan</w:t>
             </w:r>
           </w:p>
         </w:tc>
@@ -796,7 +796,7 @@
           </w:tcPr>
           <w:p>
             <w:r>
-              <w:t>________________________________</w:t>
+              <w:t>Asisten Machine Learning (mendukung Ilmania Syakira)</w:t>
             </w:r>
           </w:p>
         </w:tc>
@@ -855,7 +855,7 @@
           </w:tcPr>
           <w:p>
             <w:r>
-              <w:t>________________________________</w:t>
+              <w:t>Asisten Jaringan &amp; Konektivitas (mendukung Beny Agustirandi)</w:t>
             </w:r>
           </w:p>
         </w:tc>
@@ -914,7 +914,66 @@
           </w:tcPr>
           <w:p>
             <w:r>
-              <w:t>________________________________</w:t>
+              <w:t>Hardware &amp; PCB Design Engineer (mendukung Ryan)</w:t>
+            </w:r>
+          </w:p>
+        </w:tc>
+      </w:tr>
+      <w:tr>
+        <w:trPr>
+          <w:jc w:val="center"/>
+        </w:trPr>
+        <w:tc>
+          <w:tcPr>
+            <w:tcW w:w="825" w:type="dxa"/>
+            <w:tcMar>
+              <w:top w:w="140" w:type="dxa"/>
+              <w:left w:w="100" w:type="dxa"/>
+              <w:bottom w:w="140" w:type="dxa"/>
+              <w:right w:w="100" w:type="dxa"/>
+            </w:tcMar>
+            <w:vAlign w:val="center"/>
+          </w:tcPr>
+          <w:p>
+            <w:pPr>
+              <w:jc w:val="center"/>
+            </w:pPr>
+            <w:r>
+              <w:t>12</w:t>
+            </w:r>
+          </w:p>
+        </w:tc>
+        <w:tc>
+          <w:tcPr>
+            <w:tcW w:w="3994" w:type="dxa"/>
+            <w:tcMar>
+              <w:top w:w="140" w:type="dxa"/>
+              <w:left w:w="100" w:type="dxa"/>
+              <w:bottom w:w="140" w:type="dxa"/>
+              <w:right w:w="100" w:type="dxa"/>
+            </w:tcMar>
+            <w:vAlign w:val="center"/>
+          </w:tcPr>
+          <w:p>
+            <w:r>
+              <w:t>Erick R Koncara</w:t>
+            </w:r>
+          </w:p>
+        </w:tc>
+        <w:tc>
+          <w:tcPr>
+            <w:tcW w:w="3969" w:type="dxa"/>
+            <w:tcMar>
+              <w:top w:w="140" w:type="dxa"/>
+              <w:left w:w="100" w:type="dxa"/>
+              <w:bottom w:w="140" w:type="dxa"/>
+              <w:right w:w="100" w:type="dxa"/>
+            </w:tcMar>
+            <w:vAlign w:val="center"/>
+          </w:tcPr>
+          <w:p>
+            <w:r>
+              <w:t>Komunikator (Communicator)</w:t>
             </w:r>
           </w:p>
         </w:tc>

</xml_diff>

<commit_message>
Tambah Nashwan Iqbal Ramdhani & Dede ke tabel personel; perluas fungsi Farhan cakup AI/ML
Tabel personel diperluas 12 -> 14 baris sesuai konfirmasi user.
Fungsi Farhan diperluas mencakup Machine Learning/AI selain
software/desain/pelaporan.

Co-Authored-By: Claude Sonnet 5 <noreply@anthropic.com>
Claude-Session: https://claude.ai/code/session_013BFGCyoYuctMwQ4HieaJZM
</commit_message>
<xml_diff>
--- a/Deliverables/Surat Tugas/Surat_Tugas_LGU_SP-001_Assessment_GLD.docx
+++ b/Deliverables/Surat Tugas/Surat_Tugas_LGU_SP-001_Assessment_GLD.docx
@@ -560,7 +560,7 @@
           </w:tcPr>
           <w:p>
             <w:r>
-              <w:t>Software Frontend Developer – Desain Presentasi, CAD 3D Design, dan Pelaporan</w:t>
+              <w:t>Software Frontend Developer – Desain Presentasi, CAD 3D Design, Pelaporan, dan Machine Learning/AI</w:t>
             </w:r>
           </w:p>
         </w:tc>
@@ -978,6 +978,124 @@
           </w:p>
         </w:tc>
       </w:tr>
+      <w:tr>
+        <w:trPr>
+          <w:jc w:val="center"/>
+        </w:trPr>
+        <w:tc>
+          <w:tcPr>
+            <w:tcW w:w="825" w:type="dxa"/>
+            <w:tcMar>
+              <w:top w:w="140" w:type="dxa"/>
+              <w:left w:w="100" w:type="dxa"/>
+              <w:bottom w:w="140" w:type="dxa"/>
+              <w:right w:w="100" w:type="dxa"/>
+            </w:tcMar>
+            <w:vAlign w:val="center"/>
+          </w:tcPr>
+          <w:p>
+            <w:pPr>
+              <w:jc w:val="center"/>
+            </w:pPr>
+            <w:r>
+              <w:t>13</w:t>
+            </w:r>
+          </w:p>
+        </w:tc>
+        <w:tc>
+          <w:tcPr>
+            <w:tcW w:w="3994" w:type="dxa"/>
+            <w:tcMar>
+              <w:top w:w="140" w:type="dxa"/>
+              <w:left w:w="100" w:type="dxa"/>
+              <w:bottom w:w="140" w:type="dxa"/>
+              <w:right w:w="100" w:type="dxa"/>
+            </w:tcMar>
+            <w:vAlign w:val="center"/>
+          </w:tcPr>
+          <w:p>
+            <w:r>
+              <w:t>Nashwan Iqbal Ramdhani</w:t>
+            </w:r>
+          </w:p>
+        </w:tc>
+        <w:tc>
+          <w:tcPr>
+            <w:tcW w:w="3969" w:type="dxa"/>
+            <w:tcMar>
+              <w:top w:w="140" w:type="dxa"/>
+              <w:left w:w="100" w:type="dxa"/>
+              <w:bottom w:w="140" w:type="dxa"/>
+              <w:right w:w="100" w:type="dxa"/>
+            </w:tcMar>
+            <w:vAlign w:val="center"/>
+          </w:tcPr>
+          <w:p>
+            <w:r>
+              <w:t>Hardware Engineer (Pendukung)</w:t>
+            </w:r>
+          </w:p>
+        </w:tc>
+      </w:tr>
+      <w:tr>
+        <w:trPr>
+          <w:jc w:val="center"/>
+        </w:trPr>
+        <w:tc>
+          <w:tcPr>
+            <w:tcW w:w="825" w:type="dxa"/>
+            <w:tcMar>
+              <w:top w:w="140" w:type="dxa"/>
+              <w:left w:w="100" w:type="dxa"/>
+              <w:bottom w:w="140" w:type="dxa"/>
+              <w:right w:w="100" w:type="dxa"/>
+            </w:tcMar>
+            <w:vAlign w:val="center"/>
+          </w:tcPr>
+          <w:p>
+            <w:pPr>
+              <w:jc w:val="center"/>
+            </w:pPr>
+            <w:r>
+              <w:t>14</w:t>
+            </w:r>
+          </w:p>
+        </w:tc>
+        <w:tc>
+          <w:tcPr>
+            <w:tcW w:w="3994" w:type="dxa"/>
+            <w:tcMar>
+              <w:top w:w="140" w:type="dxa"/>
+              <w:left w:w="100" w:type="dxa"/>
+              <w:bottom w:w="140" w:type="dxa"/>
+              <w:right w:w="100" w:type="dxa"/>
+            </w:tcMar>
+            <w:vAlign w:val="center"/>
+          </w:tcPr>
+          <w:p>
+            <w:r>
+              <w:t>Dede</w:t>
+            </w:r>
+          </w:p>
+        </w:tc>
+        <w:tc>
+          <w:tcPr>
+            <w:tcW w:w="3969" w:type="dxa"/>
+            <w:tcMar>
+              <w:top w:w="140" w:type="dxa"/>
+              <w:left w:w="100" w:type="dxa"/>
+              <w:bottom w:w="140" w:type="dxa"/>
+              <w:right w:w="100" w:type="dxa"/>
+            </w:tcMar>
+            <w:vAlign w:val="center"/>
+          </w:tcPr>
+          <w:p>
+            <w:r>
+              <w:t>Asisten Administrasi Sertifikasi (mendukung Nina Siti Aminah)</w:t>
+            </w:r>
+          </w:p>
+        </w:tc>
+      </w:tr>
     </w:tbl>
     <w:p>
       <w:pPr>

</xml_diff>

<commit_message>
Standarkan deskripsi Fungsi jadi format tanggung jawab Bahasa Indonesia yang konsisten
Ganti judul campuran Indonesia-Inggris (Lead/Engineer/Developer/
Communicator) dengan format seragam "Penanggung Jawab X" / "Teknisi X"
/ "Pendukung X (membantu Y)" agar konsisten bahasa, konsisten format,
dan lebih menegaskan tanggung jawab tiap orang di surat tugas.

Co-Authored-By: Claude Sonnet 5 <noreply@anthropic.com>
Claude-Session: https://claude.ai/code/session_013BFGCyoYuctMwQ4HieaJZM
</commit_message>
<xml_diff>
--- a/Deliverables/Surat Tugas/Surat_Tugas_LGU_SP-001_Assessment_GLD.docx
+++ b/Deliverables/Surat Tugas/Surat_Tugas_LGU_SP-001_Assessment_GLD.docx
@@ -324,7 +324,7 @@
           </w:tcPr>
           <w:p>
             <w:r>
-              <w:t>Ketua Proyek &amp; Hardware Lead</w:t>
+              <w:t>Ketua Proyek merangkap Penanggung Jawab Hardware</w:t>
             </w:r>
           </w:p>
         </w:tc>
@@ -383,7 +383,7 @@
           </w:tcPr>
           <w:p>
             <w:r>
-              <w:t>Project Lead – Administrasi Sertifikasi</w:t>
+              <w:t>Penanggung Jawab Administrasi Sertifikasi</w:t>
             </w:r>
           </w:p>
         </w:tc>
@@ -442,7 +442,7 @@
           </w:tcPr>
           <w:p>
             <w:r>
-              <w:t>Machine Learning &amp; AI Lead</w:t>
+              <w:t>Penanggung Jawab Machine Learning &amp; AI</w:t>
             </w:r>
           </w:p>
         </w:tc>
@@ -501,7 +501,7 @@
           </w:tcPr>
           <w:p>
             <w:r>
-              <w:t>Jaringan LoRa, Konektivitas, dan Sistem</w:t>
+              <w:t>Penanggung Jawab Jaringan, Konektivitas, dan Sistem</w:t>
             </w:r>
           </w:p>
         </w:tc>
@@ -560,7 +560,7 @@
           </w:tcPr>
           <w:p>
             <w:r>
-              <w:t>Software Frontend Developer – Desain Presentasi, CAD 3D Design, Pelaporan, dan Machine Learning/AI</w:t>
+              <w:t>Penanggung Jawab Pengembangan Perangkat Lunak, Desain, dan Pelaporan; turut mendukung Machine Learning/AI</w:t>
             </w:r>
           </w:p>
         </w:tc>
@@ -619,7 +619,7 @@
           </w:tcPr>
           <w:p>
             <w:r>
-              <w:t>Hardware &amp; Firmware Engineer</w:t>
+              <w:t>Teknisi Hardware &amp; Firmware</w:t>
             </w:r>
           </w:p>
         </w:tc>
@@ -678,7 +678,7 @@
           </w:tcPr>
           <w:p>
             <w:r>
-              <w:t>Machine Learning Engineer</w:t>
+              <w:t>Anggota Tim Machine Learning</w:t>
             </w:r>
           </w:p>
         </w:tc>
@@ -737,7 +737,7 @@
           </w:tcPr>
           <w:p>
             <w:r>
-              <w:t>Hardware &amp; PCB Design Engineer</w:t>
+              <w:t>Teknisi Hardware &amp; Desain PCB</w:t>
             </w:r>
           </w:p>
         </w:tc>
@@ -796,7 +796,7 @@
           </w:tcPr>
           <w:p>
             <w:r>
-              <w:t>Asisten Machine Learning (mendukung Ilmania Syakira)</w:t>
+              <w:t>Pendukung Machine Learning (membantu Ilmania Syakira)</w:t>
             </w:r>
           </w:p>
         </w:tc>
@@ -855,7 +855,7 @@
           </w:tcPr>
           <w:p>
             <w:r>
-              <w:t>Asisten Jaringan &amp; Konektivitas (mendukung Beny Agustirandi)</w:t>
+              <w:t>Pendukung Jaringan &amp; Konektivitas (membantu Beny Agustirandi)</w:t>
             </w:r>
           </w:p>
         </w:tc>
@@ -914,7 +914,7 @@
           </w:tcPr>
           <w:p>
             <w:r>
-              <w:t>Hardware &amp; PCB Design Engineer (mendukung Ryan)</w:t>
+              <w:t>Teknisi Hardware &amp; Desain PCB (membantu Ryan)</w:t>
             </w:r>
           </w:p>
         </w:tc>
@@ -973,7 +973,7 @@
           </w:tcPr>
           <w:p>
             <w:r>
-              <w:t>Komunikator (Communicator)</w:t>
+              <w:t>Penanggung Jawab Komunikasi</w:t>
             </w:r>
           </w:p>
         </w:tc>
@@ -1032,7 +1032,7 @@
           </w:tcPr>
           <w:p>
             <w:r>
-              <w:t>Hardware Engineer (Pendukung)</w:t>
+              <w:t>Pendukung Hardware</w:t>
             </w:r>
           </w:p>
         </w:tc>
@@ -1091,7 +1091,7 @@
           </w:tcPr>
           <w:p>
             <w:r>
-              <w:t>Asisten Administrasi Sertifikasi (mendukung Nina Siti Aminah)</w:t>
+              <w:t>Pendukung Administrasi Sertifikasi (membantu Nina Siti Aminah)</w:t>
             </w:r>
           </w:p>
         </w:tc>

</xml_diff>

<commit_message>
Bedakan fungsi personel antara SP-001 (Sertifikasi) dan SP-002 (Field Testing)
Sebelumnya kedua surat memakai fungsi identik; sekarang dibedakan
sesuai ruang lingkup masing-masing SPK, dikonfirmasi user:
- SP-001: Maman = ATEX & redesain enclosure (bersama Farhan); Nina
  memimpin tim sertifikasi EMC/RF (anggota: Beny, Farhan, Ilmania,
  Ryan, Syifa, Aldi membantu Ryan, Anggi membantu Ilmania); Fahmi
  tetap Hardware & Firmware (tidak terlibat redesain enclosure);
  Nashwan mendukung redesain enclosure bersama Maman & Farhan.
- SP-002: fungsi tetap seperti versi sebelumnya (hardware
  lapangan, jaringan, ML/AI, dst).

Co-Authored-By: Claude Sonnet 5 <noreply@anthropic.com>
Claude-Session: https://claude.ai/code/session_013BFGCyoYuctMwQ4HieaJZM
</commit_message>
<xml_diff>
--- a/Deliverables/Surat Tugas/Surat_Tugas_LGU_SP-001_Assessment_GLD.docx
+++ b/Deliverables/Surat Tugas/Surat_Tugas_LGU_SP-001_Assessment_GLD.docx
@@ -324,7 +324,7 @@
           </w:tcPr>
           <w:p>
             <w:r>
-              <w:t>Ketua Proyek merangkap Penanggung Jawab Hardware</w:t>
+              <w:t>Ketua Proyek merangkap Penanggung Jawab ATEX &amp; Redesain Enclosure</w:t>
             </w:r>
           </w:p>
         </w:tc>
@@ -383,7 +383,7 @@
           </w:tcPr>
           <w:p>
             <w:r>
-              <w:t>Penanggung Jawab Administrasi Sertifikasi</w:t>
+              <w:t>Penanggung Jawab Administrasi Sertifikasi (Ketua Tim Sertifikasi EMC, RF, dan lainnya)</w:t>
             </w:r>
           </w:p>
         </w:tc>
@@ -442,7 +442,7 @@
           </w:tcPr>
           <w:p>
             <w:r>
-              <w:t>Penanggung Jawab Machine Learning &amp; AI</w:t>
+              <w:t>Penanggung Jawab Kajian Teknis (Engineering Review) &amp; Gap Analysis</w:t>
             </w:r>
           </w:p>
         </w:tc>
@@ -501,7 +501,7 @@
           </w:tcPr>
           <w:p>
             <w:r>
-              <w:t>Penanggung Jawab Jaringan, Konektivitas, dan Sistem</w:t>
+              <w:t>Anggota Tim Sertifikasi (EMC, RF, dan lainnya), di bawah Nina Siti Aminah</w:t>
             </w:r>
           </w:p>
         </w:tc>
@@ -560,7 +560,7 @@
           </w:tcPr>
           <w:p>
             <w:r>
-              <w:t>Penanggung Jawab Pengembangan Perangkat Lunak, Desain, dan Pelaporan; turut mendukung Machine Learning/AI</w:t>
+              <w:t>Anggota Tim Sertifikasi (EMC, RF, dan lainnya) di bawah Nina Siti Aminah; turut merancang ulang enclosure bersama Maman Budiman</w:t>
             </w:r>
           </w:p>
         </w:tc>
@@ -678,7 +678,7 @@
           </w:tcPr>
           <w:p>
             <w:r>
-              <w:t>Anggota Tim Machine Learning</w:t>
+              <w:t>Anggota Tim Sertifikasi (EMC, RF, dan lainnya), di bawah Nina Siti Aminah</w:t>
             </w:r>
           </w:p>
         </w:tc>
@@ -737,7 +737,7 @@
           </w:tcPr>
           <w:p>
             <w:r>
-              <w:t>Teknisi Hardware &amp; Desain PCB</w:t>
+              <w:t>Anggota Tim Sertifikasi (EMC, RF, dan lainnya), di bawah Nina Siti Aminah</w:t>
             </w:r>
           </w:p>
         </w:tc>
@@ -796,7 +796,7 @@
           </w:tcPr>
           <w:p>
             <w:r>
-              <w:t>Pendukung Machine Learning (membantu Ilmania Syakira)</w:t>
+              <w:t>Anggota Tim Sertifikasi (EMC, RF, dan lainnya), membantu Ilmania Syakira, di bawah Nina Siti Aminah</w:t>
             </w:r>
           </w:p>
         </w:tc>
@@ -855,7 +855,7 @@
           </w:tcPr>
           <w:p>
             <w:r>
-              <w:t>Pendukung Jaringan &amp; Konektivitas (membantu Beny Agustirandi)</w:t>
+              <w:t>Anggota Tim Sertifikasi (EMC, RF, dan lainnya), di bawah Nina Siti Aminah</w:t>
             </w:r>
           </w:p>
         </w:tc>
@@ -914,7 +914,7 @@
           </w:tcPr>
           <w:p>
             <w:r>
-              <w:t>Teknisi Hardware &amp; Desain PCB (membantu Ryan)</w:t>
+              <w:t>Anggota Tim Sertifikasi (EMC, RF, dan lainnya), membantu Ryan, di bawah Nina Siti Aminah</w:t>
             </w:r>
           </w:p>
         </w:tc>
@@ -973,7 +973,7 @@
           </w:tcPr>
           <w:p>
             <w:r>
-              <w:t>Penanggung Jawab Komunikasi</w:t>
+              <w:t>Penanggung Jawab Komunikasi (koordinasi dengan lembaga sertifikasi)</w:t>
             </w:r>
           </w:p>
         </w:tc>
@@ -1032,7 +1032,7 @@
           </w:tcPr>
           <w:p>
             <w:r>
-              <w:t>Pendukung Hardware</w:t>
+              <w:t>Pendukung Hardware (mendukung redesain enclosure bersama Maman Budiman &amp; Farhan Budiman)</w:t>
             </w:r>
           </w:p>
         </w:tc>

</xml_diff>